<commit_message>
docs(diseno): casos de uso UML (22 CU, figuras 7-11) y referencias APA en la evidencia de BD
</commit_message>
<xml_diff>
--- a/docs/02-diseno/Evidencia-construccion-BD-cindec_db.docx
+++ b/docs/02-diseno/Evidencia-construccion-BD-cindec_db.docx
@@ -5812,6 +5812,410 @@
         <w:t xml:space="preserve">La base de datos quedó construida tal como se definió en el modelo entidad-relación, el diseño lógico y la normalización aprobados. Las pruebas demostraron que la propia base de datos impide los datos inválidos más importantes (duplicados, referencias inexistentes, borrados indebidos, fechas imposibles y calificaciones fuera de rango), lo que atiende los requerimientos RNF-08 y RNF-10. Las reglas que no se pueden expresar en la base de datos, como el control de cupo o el cálculo de aprobada/no aprobada, quedan asignadas a la capa de servicios del backend. En la fase de Desarrollo, esta estructura se recreará con migraciones de Sequelize.</w:t>
       </w:r>
     </w:p>
+    <w:p>
+      <w:pPr>
+        <w:pStyle w:val="Heading1"/>
+      </w:pPr>
+      <w:r>
+        <w:t xml:space="preserve">Referencias</w:t>
+      </w:r>
+    </w:p>
+    <w:p>
+      <w:pPr>
+        <w:spacing w:after="160" w:line="360"/>
+        <w:ind w:left="720" w:hanging="720"/>
+      </w:pPr>
+      <w:r>
+        <w:rPr>
+          <w:rFonts w:ascii="Arial" w:cs="Arial" w:eastAsia="Arial" w:hAnsi="Arial"/>
+          <w:i w:val="false"/>
+          <w:iCs w:val="false"/>
+          <w:sz w:val="22"/>
+          <w:szCs w:val="22"/>
+        </w:rPr>
+        <w:t xml:space="preserve">Codd, E. F. (1970). A relational model of data for large shared data banks. </w:t>
+      </w:r>
+      <w:r>
+        <w:rPr>
+          <w:rFonts w:ascii="Arial" w:cs="Arial" w:eastAsia="Arial" w:hAnsi="Arial"/>
+          <w:i/>
+          <w:iCs/>
+          <w:sz w:val="22"/>
+          <w:szCs w:val="22"/>
+        </w:rPr>
+        <w:t xml:space="preserve">Communications of the ACM, 13</w:t>
+      </w:r>
+      <w:r>
+        <w:rPr>
+          <w:rFonts w:ascii="Arial" w:cs="Arial" w:eastAsia="Arial" w:hAnsi="Arial"/>
+          <w:i w:val="false"/>
+          <w:iCs w:val="false"/>
+          <w:sz w:val="22"/>
+          <w:szCs w:val="22"/>
+        </w:rPr>
+        <w:t xml:space="preserve">(6), 377–387. https://doi.org/10.1145/362384.362685</w:t>
+      </w:r>
+    </w:p>
+    <w:p>
+      <w:pPr>
+        <w:spacing w:after="160" w:line="360"/>
+        <w:ind w:left="720" w:hanging="720"/>
+      </w:pPr>
+      <w:r>
+        <w:rPr>
+          <w:rFonts w:ascii="Arial" w:cs="Arial" w:eastAsia="Arial" w:hAnsi="Arial"/>
+          <w:i w:val="false"/>
+          <w:iCs w:val="false"/>
+          <w:sz w:val="22"/>
+          <w:szCs w:val="22"/>
+        </w:rPr>
+        <w:t xml:space="preserve">Consejo Nacional de Normalización y Certificación de Competencias Laborales. (s.f.). </w:t>
+      </w:r>
+      <w:r>
+        <w:rPr>
+          <w:rFonts w:ascii="Arial" w:cs="Arial" w:eastAsia="Arial" w:hAnsi="Arial"/>
+          <w:i/>
+          <w:iCs/>
+          <w:sz w:val="22"/>
+          <w:szCs w:val="22"/>
+        </w:rPr>
+        <w:t xml:space="preserve">Manual del participante: Red de prestadores de servicios</w:t>
+      </w:r>
+      <w:r>
+        <w:rPr>
+          <w:rFonts w:ascii="Arial" w:cs="Arial" w:eastAsia="Arial" w:hAnsi="Arial"/>
+          <w:i w:val="false"/>
+          <w:iCs w:val="false"/>
+          <w:sz w:val="22"/>
+          <w:szCs w:val="22"/>
+        </w:rPr>
+        <w:t xml:space="preserve"> [Manual]. Secretaría de Educación Pública.</w:t>
+      </w:r>
+    </w:p>
+    <w:p>
+      <w:pPr>
+        <w:spacing w:after="160" w:line="360"/>
+        <w:ind w:left="720" w:hanging="720"/>
+      </w:pPr>
+      <w:r>
+        <w:rPr>
+          <w:rFonts w:ascii="Arial" w:cs="Arial" w:eastAsia="Arial" w:hAnsi="Arial"/>
+          <w:i w:val="false"/>
+          <w:iCs w:val="false"/>
+          <w:sz w:val="22"/>
+          <w:szCs w:val="22"/>
+        </w:rPr>
+        <w:t xml:space="preserve">Oracle Corporation. (s.f.-a). </w:t>
+      </w:r>
+      <w:r>
+        <w:rPr>
+          <w:rFonts w:ascii="Arial" w:cs="Arial" w:eastAsia="Arial" w:hAnsi="Arial"/>
+          <w:i/>
+          <w:iCs/>
+          <w:sz w:val="22"/>
+          <w:szCs w:val="22"/>
+        </w:rPr>
+        <w:t xml:space="preserve">CHECK constraints</w:t>
+      </w:r>
+      <w:r>
+        <w:rPr>
+          <w:rFonts w:ascii="Arial" w:cs="Arial" w:eastAsia="Arial" w:hAnsi="Arial"/>
+          <w:i w:val="false"/>
+          <w:iCs w:val="false"/>
+          <w:sz w:val="22"/>
+          <w:szCs w:val="22"/>
+        </w:rPr>
+        <w:t xml:space="preserve"> (Sección 15.1.20.6). MySQL 8.0 Reference Manual. Recuperado el 21 de octubre de 2026, de https://dev.mysql.com/doc/refman/8.0/en/create-table-check-constraints.html</w:t>
+      </w:r>
+    </w:p>
+    <w:p>
+      <w:pPr>
+        <w:spacing w:after="160" w:line="360"/>
+        <w:ind w:left="720" w:hanging="720"/>
+      </w:pPr>
+      <w:r>
+        <w:rPr>
+          <w:rFonts w:ascii="Arial" w:cs="Arial" w:eastAsia="Arial" w:hAnsi="Arial"/>
+          <w:i w:val="false"/>
+          <w:iCs w:val="false"/>
+          <w:sz w:val="22"/>
+          <w:szCs w:val="22"/>
+        </w:rPr>
+        <w:t xml:space="preserve">Oracle Corporation. (s.f.-b). </w:t>
+      </w:r>
+      <w:r>
+        <w:rPr>
+          <w:rFonts w:ascii="Arial" w:cs="Arial" w:eastAsia="Arial" w:hAnsi="Arial"/>
+          <w:i/>
+          <w:iCs/>
+          <w:sz w:val="22"/>
+          <w:szCs w:val="22"/>
+        </w:rPr>
+        <w:t xml:space="preserve">CREATE TABLE statement</w:t>
+      </w:r>
+      <w:r>
+        <w:rPr>
+          <w:rFonts w:ascii="Arial" w:cs="Arial" w:eastAsia="Arial" w:hAnsi="Arial"/>
+          <w:i w:val="false"/>
+          <w:iCs w:val="false"/>
+          <w:sz w:val="22"/>
+          <w:szCs w:val="22"/>
+        </w:rPr>
+        <w:t xml:space="preserve"> (Sección 15.1.20). MySQL 8.0 Reference Manual. Recuperado el 21 de octubre de 2026, de https://dev.mysql.com/doc/refman/8.0/en/create-table.html</w:t>
+      </w:r>
+    </w:p>
+    <w:p>
+      <w:pPr>
+        <w:spacing w:after="160" w:line="360"/>
+        <w:ind w:left="720" w:hanging="720"/>
+      </w:pPr>
+      <w:r>
+        <w:rPr>
+          <w:rFonts w:ascii="Arial" w:cs="Arial" w:eastAsia="Arial" w:hAnsi="Arial"/>
+          <w:i w:val="false"/>
+          <w:iCs w:val="false"/>
+          <w:sz w:val="22"/>
+          <w:szCs w:val="22"/>
+        </w:rPr>
+        <w:t xml:space="preserve">Oracle Corporation. (s.f.-c). </w:t>
+      </w:r>
+      <w:r>
+        <w:rPr>
+          <w:rFonts w:ascii="Arial" w:cs="Arial" w:eastAsia="Arial" w:hAnsi="Arial"/>
+          <w:i/>
+          <w:iCs/>
+          <w:sz w:val="22"/>
+          <w:szCs w:val="22"/>
+        </w:rPr>
+        <w:t xml:space="preserve">The ENUM type</w:t>
+      </w:r>
+      <w:r>
+        <w:rPr>
+          <w:rFonts w:ascii="Arial" w:cs="Arial" w:eastAsia="Arial" w:hAnsi="Arial"/>
+          <w:i w:val="false"/>
+          <w:iCs w:val="false"/>
+          <w:sz w:val="22"/>
+          <w:szCs w:val="22"/>
+        </w:rPr>
+        <w:t xml:space="preserve"> (Sección 13.3.5). MySQL 8.0 Reference Manual. Recuperado el 21 de octubre de 2026, de https://dev.mysql.com/doc/refman/8.0/en/enum.html</w:t>
+      </w:r>
+    </w:p>
+    <w:p>
+      <w:pPr>
+        <w:spacing w:after="160" w:line="360"/>
+        <w:ind w:left="720" w:hanging="720"/>
+      </w:pPr>
+      <w:r>
+        <w:rPr>
+          <w:rFonts w:ascii="Arial" w:cs="Arial" w:eastAsia="Arial" w:hAnsi="Arial"/>
+          <w:i w:val="false"/>
+          <w:iCs w:val="false"/>
+          <w:sz w:val="22"/>
+          <w:szCs w:val="22"/>
+        </w:rPr>
+        <w:t xml:space="preserve">Oracle Corporation. (s.f.-d). </w:t>
+      </w:r>
+      <w:r>
+        <w:rPr>
+          <w:rFonts w:ascii="Arial" w:cs="Arial" w:eastAsia="Arial" w:hAnsi="Arial"/>
+          <w:i/>
+          <w:iCs/>
+          <w:sz w:val="22"/>
+          <w:szCs w:val="22"/>
+        </w:rPr>
+        <w:t xml:space="preserve">Fixed-point types (exact value) - DECIMAL, NUMERIC</w:t>
+      </w:r>
+      <w:r>
+        <w:rPr>
+          <w:rFonts w:ascii="Arial" w:cs="Arial" w:eastAsia="Arial" w:hAnsi="Arial"/>
+          <w:i w:val="false"/>
+          <w:iCs w:val="false"/>
+          <w:sz w:val="22"/>
+          <w:szCs w:val="22"/>
+        </w:rPr>
+        <w:t xml:space="preserve"> (Sección 13.1.3). MySQL 8.0 Reference Manual. Recuperado el 21 de octubre de 2026, de https://dev.mysql.com/doc/refman/8.0/en/fixed-point-types.html</w:t>
+      </w:r>
+    </w:p>
+    <w:p>
+      <w:pPr>
+        <w:spacing w:after="160" w:line="360"/>
+        <w:ind w:left="720" w:hanging="720"/>
+      </w:pPr>
+      <w:r>
+        <w:rPr>
+          <w:rFonts w:ascii="Arial" w:cs="Arial" w:eastAsia="Arial" w:hAnsi="Arial"/>
+          <w:i w:val="false"/>
+          <w:iCs w:val="false"/>
+          <w:sz w:val="22"/>
+          <w:szCs w:val="22"/>
+        </w:rPr>
+        <w:t xml:space="preserve">Oracle Corporation. (s.f.-e). </w:t>
+      </w:r>
+      <w:r>
+        <w:rPr>
+          <w:rFonts w:ascii="Arial" w:cs="Arial" w:eastAsia="Arial" w:hAnsi="Arial"/>
+          <w:i/>
+          <w:iCs/>
+          <w:sz w:val="22"/>
+          <w:szCs w:val="22"/>
+        </w:rPr>
+        <w:t xml:space="preserve">FOREIGN KEY constraints</w:t>
+      </w:r>
+      <w:r>
+        <w:rPr>
+          <w:rFonts w:ascii="Arial" w:cs="Arial" w:eastAsia="Arial" w:hAnsi="Arial"/>
+          <w:i w:val="false"/>
+          <w:iCs w:val="false"/>
+          <w:sz w:val="22"/>
+          <w:szCs w:val="22"/>
+        </w:rPr>
+        <w:t xml:space="preserve"> (Sección 15.1.20.5). MySQL 8.0 Reference Manual. Recuperado el 21 de octubre de 2026, de https://dev.mysql.com/doc/refman/8.0/en/create-table-foreign-keys.html</w:t>
+      </w:r>
+    </w:p>
+    <w:p>
+      <w:pPr>
+        <w:spacing w:after="160" w:line="360"/>
+        <w:ind w:left="720" w:hanging="720"/>
+      </w:pPr>
+      <w:r>
+        <w:rPr>
+          <w:rFonts w:ascii="Arial" w:cs="Arial" w:eastAsia="Arial" w:hAnsi="Arial"/>
+          <w:i w:val="false"/>
+          <w:iCs w:val="false"/>
+          <w:sz w:val="22"/>
+          <w:szCs w:val="22"/>
+        </w:rPr>
+        <w:t xml:space="preserve">Oracle Corporation. (s.f.-f). </w:t>
+      </w:r>
+      <w:r>
+        <w:rPr>
+          <w:rFonts w:ascii="Arial" w:cs="Arial" w:eastAsia="Arial" w:hAnsi="Arial"/>
+          <w:i/>
+          <w:iCs/>
+          <w:sz w:val="22"/>
+          <w:szCs w:val="22"/>
+        </w:rPr>
+        <w:t xml:space="preserve">How MySQL uses indexes</w:t>
+      </w:r>
+      <w:r>
+        <w:rPr>
+          <w:rFonts w:ascii="Arial" w:cs="Arial" w:eastAsia="Arial" w:hAnsi="Arial"/>
+          <w:i w:val="false"/>
+          <w:iCs w:val="false"/>
+          <w:sz w:val="22"/>
+          <w:szCs w:val="22"/>
+        </w:rPr>
+        <w:t xml:space="preserve"> (Sección 10.3.1). MySQL 8.0 Reference Manual. Recuperado el 21 de octubre de 2026, de https://dev.mysql.com/doc/refman/8.0/en/mysql-indexes.html</w:t>
+      </w:r>
+    </w:p>
+    <w:p>
+      <w:pPr>
+        <w:spacing w:after="160" w:line="360"/>
+        <w:ind w:left="720" w:hanging="720"/>
+      </w:pPr>
+      <w:r>
+        <w:rPr>
+          <w:rFonts w:ascii="Arial" w:cs="Arial" w:eastAsia="Arial" w:hAnsi="Arial"/>
+          <w:i w:val="false"/>
+          <w:iCs w:val="false"/>
+          <w:sz w:val="22"/>
+          <w:szCs w:val="22"/>
+        </w:rPr>
+        <w:t xml:space="preserve">Oracle Corporation. (s.f.-g). </w:t>
+      </w:r>
+      <w:r>
+        <w:rPr>
+          <w:rFonts w:ascii="Arial" w:cs="Arial" w:eastAsia="Arial" w:hAnsi="Arial"/>
+          <w:i/>
+          <w:iCs/>
+          <w:sz w:val="22"/>
+          <w:szCs w:val="22"/>
+        </w:rPr>
+        <w:t xml:space="preserve">Reverse engineering</w:t>
+      </w:r>
+      <w:r>
+        <w:rPr>
+          <w:rFonts w:ascii="Arial" w:cs="Arial" w:eastAsia="Arial" w:hAnsi="Arial"/>
+          <w:i w:val="false"/>
+          <w:iCs w:val="false"/>
+          <w:sz w:val="22"/>
+          <w:szCs w:val="22"/>
+        </w:rPr>
+        <w:t xml:space="preserve"> (Sección 9.4.2). MySQL Workbench Manual. Recuperado el 21 de octubre de 2026, de https://dev.mysql.com/doc/workbench/en/wb-reverse-engineering.html</w:t>
+      </w:r>
+    </w:p>
+    <w:p>
+      <w:pPr>
+        <w:spacing w:after="160" w:line="360"/>
+        <w:ind w:left="720" w:hanging="720"/>
+      </w:pPr>
+      <w:r>
+        <w:rPr>
+          <w:rFonts w:ascii="Arial" w:cs="Arial" w:eastAsia="Arial" w:hAnsi="Arial"/>
+          <w:i w:val="false"/>
+          <w:iCs w:val="false"/>
+          <w:sz w:val="22"/>
+          <w:szCs w:val="22"/>
+        </w:rPr>
+        <w:t xml:space="preserve">Oracle Corporation. (s.f.-h). </w:t>
+      </w:r>
+      <w:r>
+        <w:rPr>
+          <w:rFonts w:ascii="Arial" w:cs="Arial" w:eastAsia="Arial" w:hAnsi="Arial"/>
+          <w:i/>
+          <w:iCs/>
+          <w:sz w:val="22"/>
+          <w:szCs w:val="22"/>
+        </w:rPr>
+        <w:t xml:space="preserve">The utf8mb4 character set (4-byte UTF-8 Unicode encoding)</w:t>
+      </w:r>
+      <w:r>
+        <w:rPr>
+          <w:rFonts w:ascii="Arial" w:cs="Arial" w:eastAsia="Arial" w:hAnsi="Arial"/>
+          <w:i w:val="false"/>
+          <w:iCs w:val="false"/>
+          <w:sz w:val="22"/>
+          <w:szCs w:val="22"/>
+        </w:rPr>
+        <w:t xml:space="preserve"> (Sección 12.9.1). MySQL 8.0 Reference Manual. Recuperado el 21 de octubre de 2026, de https://dev.mysql.com/doc/refman/8.0/en/charset-unicode-utf8mb4.html</w:t>
+      </w:r>
+    </w:p>
+    <w:p>
+      <w:pPr>
+        <w:spacing w:after="160" w:line="360"/>
+        <w:ind w:left="720" w:hanging="720"/>
+      </w:pPr>
+      <w:r>
+        <w:rPr>
+          <w:rFonts w:ascii="Arial" w:cs="Arial" w:eastAsia="Arial" w:hAnsi="Arial"/>
+          <w:i w:val="false"/>
+          <w:iCs w:val="false"/>
+          <w:sz w:val="22"/>
+          <w:szCs w:val="22"/>
+        </w:rPr>
+        <w:t xml:space="preserve">Sequelize. (s.f.). </w:t>
+      </w:r>
+      <w:r>
+        <w:rPr>
+          <w:rFonts w:ascii="Arial" w:cs="Arial" w:eastAsia="Arial" w:hAnsi="Arial"/>
+          <w:i/>
+          <w:iCs/>
+          <w:sz w:val="22"/>
+          <w:szCs w:val="22"/>
+        </w:rPr>
+        <w:t xml:space="preserve">Migrations</w:t>
+      </w:r>
+      <w:r>
+        <w:rPr>
+          <w:rFonts w:ascii="Arial" w:cs="Arial" w:eastAsia="Arial" w:hAnsi="Arial"/>
+          <w:i w:val="false"/>
+          <w:iCs w:val="false"/>
+          <w:sz w:val="22"/>
+          <w:szCs w:val="22"/>
+        </w:rPr>
+        <w:t xml:space="preserve">. Sequelize v6 Documentation. Recuperado el 21 de octubre de 2026, de https://sequelize.org/docs/v6/other-topics/migrations/</w:t>
+      </w:r>
+    </w:p>
     <w:sectPr>
       <w:footerReference w:type="default" r:id="rId7"/>
       <w:pgSz w:w="12240" w:h="15840" w:orient="portrait"/>

</xml_diff>